<commit_message>
Add real screenshots (Docker Desktop, k6 dashboard) to the technical report
Replaces/complements the matplotlib charts with actual screen captures the
user took: Docker Desktop's Resource usage panel showing the restful-booker
container's live CPU spike during a breakpoint re-run (18-27%, matching the
docker-stats numbers already in the report), and the k6 HTML dashboard open
in Chrome for the spike profile. Placed right next to Figures 1 and 2 in the
Word report as 1b/2b.

Co-Authored-By: Claude Sonnet 5 <noreply@anthropic.com>
</commit_message>
<xml_diff>
--- a/master-plan/load-testing/report/Informe_Tecnico_Actividad3_RestfulBooker.docx
+++ b/master-plan/load-testing/report/Informe_Tecnico_Actividad3_RestfulBooker.docx
@@ -2314,38 +2314,13 @@
     </w:p>
     <w:p>
       <w:pPr>
-        <w:spacing w:after="160"/>
-      </w:pPr>
-      <w:r>
-        <w:t xml:space="preserve">Sobre el throughput: no incumple por falla del sistema — error rate 0% y latencia estable indican margen de sobra. El SLO de 150 TPS es una referencia genérica del curso; nuestro modelo de carga (think time realista, no tráfico puro) pone un techo bajo al throughput por VU sin importar cuántas VUs se agreguen. Decisión del equipo: se documenta la brecha como hallazgo, no como incumplimiento oculto, y se recalibra el SLO al contexto real modelado.</w:t>
-      </w:r>
-    </w:p>
-    <w:p>
-      <w:pPr>
-        <w:pStyle w:val="Heading1"/>
-        <w:spacing w:after="160" w:before="320"/>
-      </w:pPr>
-      <w:r>
-        <w:t xml:space="preserve">6. Cuellos de botella identificados</w:t>
-      </w:r>
-    </w:p>
-    <w:p>
-      <w:pPr>
-        <w:spacing w:after="160"/>
-      </w:pPr>
-      <w:r>
-        <w:t xml:space="preserve">load, stress y spike (hasta 150 VUs) no lograron estresar la API: 0% error, latencia estable, CPU bajo 2%. Por eso se agregó breakpoint, empujando hasta 1000 VUs — y ahí sí apareció señal real de presión (ver Figura 2). Aun así, tampoco a 1000 VUs se incumplió ningún SLO (0% error, p95=8.09ms).</w:t>
-      </w:r>
-    </w:p>
-    <w:p>
-      <w:pPr>
         <w:spacing w:after="60" w:before="120"/>
         <w:jc w:val="center"/>
       </w:pPr>
       <w:r>
         <w:drawing>
           <wp:inline distT="0" distB="0" distL="0" distR="0">
-            <wp:extent cx="5524500" cy="3095625"/>
+            <wp:extent cx="5524500" cy="2781300"/>
             <wp:effectExtent t="0" r="0" b="0" l="0"/>
             <wp:docPr id="1" name="" descr="" title=""/>
             <wp:cNvGraphicFramePr>
@@ -2370,6 +2345,93 @@
                   <pic:spPr bwMode="auto">
                     <a:xfrm>
                       <a:off x="0" y="0"/>
+                      <a:ext cx="5524500" cy="2781300"/>
+                    </a:xfrm>
+                    <a:prstGeom prst="rect">
+                      <a:avLst/>
+                    </a:prstGeom>
+                  </pic:spPr>
+                </pic:pic>
+              </a:graphicData>
+            </a:graphic>
+          </wp:inline>
+        </w:drawing>
+      </w:r>
+    </w:p>
+    <w:p>
+      <w:pPr>
+        <w:spacing w:after="200"/>
+        <w:jc w:val="center"/>
+      </w:pPr>
+      <w:r>
+        <w:rPr>
+          <w:i/>
+          <w:iCs/>
+          <w:color w:val="555555"/>
+          <w:sz w:val="18"/>
+          <w:szCs w:val="18"/>
+        </w:rPr>
+        <w:t xml:space="preserve">Figura 1b — Captura real del dashboard HTML de k6 (perfil spike, 150 VUs) abierto en el navegador: Request Rate, Request Duration p(95) y VUs a lo largo del tiempo.</w:t>
+      </w:r>
+    </w:p>
+    <w:p>
+      <w:pPr>
+        <w:spacing w:after="160"/>
+      </w:pPr>
+      <w:r>
+        <w:t xml:space="preserve">Sobre el throughput: no incumple por falla del sistema — error rate 0% y latencia estable indican margen de sobra. El SLO de 150 TPS es una referencia genérica del curso; nuestro modelo de carga (think time realista, no tráfico puro) pone un techo bajo al throughput por VU sin importar cuántas VUs se agreguen. Decisión del equipo: se documenta la brecha como hallazgo, no como incumplimiento oculto, y se recalibra el SLO al contexto real modelado.</w:t>
+      </w:r>
+    </w:p>
+    <w:p>
+      <w:pPr>
+        <w:pStyle w:val="Heading1"/>
+        <w:spacing w:after="160" w:before="320"/>
+      </w:pPr>
+      <w:r>
+        <w:t xml:space="preserve">6. Cuellos de botella identificados</w:t>
+      </w:r>
+    </w:p>
+    <w:p>
+      <w:pPr>
+        <w:spacing w:after="160"/>
+      </w:pPr>
+      <w:r>
+        <w:t xml:space="preserve">load, stress y spike (hasta 150 VUs) no lograron estresar la API: 0% error, latencia estable, CPU bajo 2%. Por eso se agregó breakpoint, empujando hasta 1000 VUs — y ahí sí apareció señal real de presión (ver Figura 2). Aun así, tampoco a 1000 VUs se incumplió ningún SLO (0% error, p95=8.09ms).</w:t>
+      </w:r>
+    </w:p>
+    <w:p>
+      <w:pPr>
+        <w:spacing w:after="60" w:before="120"/>
+        <w:jc w:val="center"/>
+      </w:pPr>
+      <w:r>
+        <w:drawing>
+          <wp:inline distT="0" distB="0" distL="0" distR="0">
+            <wp:extent cx="5524500" cy="3095625"/>
+            <wp:effectExtent t="0" r="0" b="0" l="0"/>
+            <wp:docPr id="1" name="" descr="" title=""/>
+            <wp:cNvGraphicFramePr>
+              <a:graphicFrameLocks xmlns:a="http://schemas.openxmlformats.org/drawingml/2006/main" noChangeAspect="1"/>
+            </wp:cNvGraphicFramePr>
+            <a:graphic xmlns:a="http://schemas.openxmlformats.org/drawingml/2006/main">
+              <a:graphicData uri="http://schemas.openxmlformats.org/drawingml/2006/picture">
+                <pic:pic xmlns:pic="http://schemas.openxmlformats.org/drawingml/2006/picture">
+                  <pic:nvPicPr>
+                    <pic:cNvPr id="0" name="" descr=""/>
+                    <pic:cNvPicPr>
+                      <a:picLocks noChangeAspect="1" noChangeArrowheads="1"/>
+                    </pic:cNvPicPr>
+                  </pic:nvPicPr>
+                  <pic:blipFill>
+                    <a:blip r:embed="rId9" cstate="none"/>
+                    <a:srcRect/>
+                    <a:stretch>
+                      <a:fillRect/>
+                    </a:stretch>
+                  </pic:blipFill>
+                  <pic:spPr bwMode="auto">
+                    <a:xfrm>
+                      <a:off x="0" y="0"/>
                       <a:ext cx="5524500" cy="3095625"/>
                     </a:xfrm>
                     <a:prstGeom prst="rect">
@@ -2396,7 +2458,69 @@
           <w:sz w:val="18"/>
           <w:szCs w:val="18"/>
         </w:rPr>
-        <w:t xml:space="preserve">Figura 2 — CPU y RAM del contenedor durante breakpoint (escalones 0→1000 VUs). La caída al final corresponde al ramp-down a 0 VUs.</w:t>
+        <w:t xml:space="preserve">Figura 2 — CPU y RAM del contenedor durante breakpoint (escalones 0→1000 VUs), reconstruida desde las muestras de docker stats. La caída al final corresponde al ramp-down a 0 VUs.</w:t>
+      </w:r>
+    </w:p>
+    <w:p>
+      <w:pPr>
+        <w:spacing w:after="60" w:before="120"/>
+        <w:jc w:val="center"/>
+      </w:pPr>
+      <w:r>
+        <w:drawing>
+          <wp:inline distT="0" distB="0" distL="0" distR="0">
+            <wp:extent cx="5524500" cy="2876550"/>
+            <wp:effectExtent t="0" r="0" b="0" l="0"/>
+            <wp:docPr id="1" name="" descr="" title=""/>
+            <wp:cNvGraphicFramePr>
+              <a:graphicFrameLocks xmlns:a="http://schemas.openxmlformats.org/drawingml/2006/main" noChangeAspect="1"/>
+            </wp:cNvGraphicFramePr>
+            <a:graphic xmlns:a="http://schemas.openxmlformats.org/drawingml/2006/main">
+              <a:graphicData uri="http://schemas.openxmlformats.org/drawingml/2006/picture">
+                <pic:pic xmlns:pic="http://schemas.openxmlformats.org/drawingml/2006/picture">
+                  <pic:nvPicPr>
+                    <pic:cNvPr id="0" name="" descr=""/>
+                    <pic:cNvPicPr>
+                      <a:picLocks noChangeAspect="1" noChangeArrowheads="1"/>
+                    </pic:cNvPicPr>
+                  </pic:nvPicPr>
+                  <pic:blipFill>
+                    <a:blip r:embed="rId10" cstate="none"/>
+                    <a:srcRect/>
+                    <a:stretch>
+                      <a:fillRect/>
+                    </a:stretch>
+                  </pic:blipFill>
+                  <pic:spPr bwMode="auto">
+                    <a:xfrm>
+                      <a:off x="0" y="0"/>
+                      <a:ext cx="5524500" cy="2876550"/>
+                    </a:xfrm>
+                    <a:prstGeom prst="rect">
+                      <a:avLst/>
+                    </a:prstGeom>
+                  </pic:spPr>
+                </pic:pic>
+              </a:graphicData>
+            </a:graphic>
+          </wp:inline>
+        </w:drawing>
+      </w:r>
+    </w:p>
+    <w:p>
+      <w:pPr>
+        <w:spacing w:after="200"/>
+        <w:jc w:val="center"/>
+      </w:pPr>
+      <w:r>
+        <w:rPr>
+          <w:i/>
+          <w:iCs/>
+          <w:color w:val="555555"/>
+          <w:sz w:val="18"/>
+          <w:szCs w:val="18"/>
+        </w:rPr>
+        <w:t xml:space="preserve">Figura 2b — Captura real de Docker Desktop (pestaña Containers → Resource usage) mostrando el mismo contenedor restful-booker en vivo, con el pico de CPU (18.23% marcado en el tooltip) visible en la gráfica histórica.</w:t>
       </w:r>
     </w:p>
     <w:p>
@@ -2500,7 +2624,7 @@
         <w:spacing w:after="160"/>
       </w:pPr>
       <w:r>
-        <w:t xml:space="preserve">Restful-Booker cumple todos los SLO salvo throughput (brecha explicada por el diseño del modelo de carga, no por el sistema) hasta 1000 VUs concurrentes: 0% de errores, p95 máximo de 10.11ms contra un umbral de 800ms, sin señales de degradación sostenida. Sí hay evidencia de que el sistema trabaja más bajo carga (CPU y RAM escalan claramente entre 15 y 1000 VUs), pero el punto de quiebre real sigue sin encontrarse dentro de lo probado. La API está lista para el nivel de tráfico aquí modelado, e incluso para picos varias veces mayores a lo asumido inicialmente. Antes de prometer más, se recomienda empujar la concurrencia sin think time y probar con volumen de datos representativo — temas para el debrief de EV-5.</w:t>
+        <w:t xml:space="preserve">Restful-Booker cumple todos los SLO salvo throughput (brecha explicada por el diseño del modelo de carga, no por el sistema) hasta 1000 VUs concurrentes: 0% de errores, p95 máximo de 10.11ms contra un umbral de 800ms, sin señales de degradación sostenida. Sí hay evidencia de que el sistema trabaja más bajo carga (CPU y RAM escalan claramente entre 15 y 1000 VUs, confirmado tanto por docker stats como por Docker Desktop en vivo), pero el punto de quiebre real sigue sin encontrarse dentro de lo probado. La API está lista para el nivel de tráfico aquí modelado, e incluso para picos varias veces mayores a lo asumido inicialmente. Antes de prometer más, se recomienda empujar la concurrencia sin think time y probar con volumen de datos representativo — temas para el debrief de EV-5.</w:t>
       </w:r>
     </w:p>
     <w:p>

</xml_diff>

<commit_message>
Add terminal screenshot as Figura 3, confirm professor name on cover
Real screenshot the user took of their own terminal running
"PROFILE=smoke k6 run scripts/load_test.js" against the Dockerized API,
showing the THRESHOLDS block and all checks green — evidence that the
script runs directly from a terminal, not only through assistant tooling
(mirrors the execution style shown in the course's k6 taller guide and in
the classmate's reference report).

Co-Authored-By: Claude Sonnet 5 <noreply@anthropic.com>
</commit_message>
<xml_diff>
--- a/master-plan/load-testing/report/Informe_Tecnico_Actividad3_RestfulBooker.docx
+++ b/master-plan/load-testing/report/Informe_Tecnico_Actividad3_RestfulBooker.docx
@@ -5757,6 +5757,97 @@
           <w:szCs w:val="17"/>
         </w:rPr>
         <w:t xml:space="preserve"> </w:t>
+      </w:r>
+    </w:p>
+    <w:p>
+      <w:pPr>
+        <w:spacing w:line="480" w:lineRule="auto"/>
+      </w:pPr>
+      <w:r>
+        <w:rPr>
+          <w:rFonts w:ascii="Times New Roman" w:cs="Times New Roman" w:eastAsia="Times New Roman" w:hAnsi="Times New Roman"/>
+          <w:sz w:val="24"/>
+          <w:szCs w:val="24"/>
+        </w:rPr>
+        <w:t xml:space="preserve"> </w:t>
+      </w:r>
+    </w:p>
+    <w:p>
+      <w:pPr>
+        <w:spacing w:line="480" w:lineRule="auto"/>
+        <w:ind w:firstLine="720"/>
+      </w:pPr>
+      <w:r>
+        <w:rPr>
+          <w:rFonts w:ascii="Times New Roman" w:cs="Times New Roman" w:eastAsia="Times New Roman" w:hAnsi="Times New Roman"/>
+          <w:sz w:val="24"/>
+          <w:szCs w:val="24"/>
+        </w:rPr>
+        <w:t xml:space="preserve">Como evidencia de que el script se ejecutó realmente desde una terminal contra la API en Docker (y no únicamente mediante herramientas de asistencia), la Figura 3 muestra la corrida del perfil smoke desde la terminal del equipo, con el bloque THRESHOLDS y los nueve checks en verde (100% de éxito).</w:t>
+      </w:r>
+    </w:p>
+    <w:p>
+      <w:pPr>
+        <w:keepNext/>
+        <w:spacing w:after="60" w:before="120"/>
+        <w:jc w:val="center"/>
+      </w:pPr>
+      <w:r>
+        <w:drawing>
+          <wp:inline distT="0" distB="0" distL="0" distR="0">
+            <wp:extent cx="4572000" cy="2743200"/>
+            <wp:effectExtent t="0" r="0" b="0" l="0"/>
+            <wp:docPr id="1" name="" descr="" title=""/>
+            <wp:cNvGraphicFramePr>
+              <a:graphicFrameLocks xmlns:a="http://schemas.openxmlformats.org/drawingml/2006/main" noChangeAspect="1"/>
+            </wp:cNvGraphicFramePr>
+            <a:graphic xmlns:a="http://schemas.openxmlformats.org/drawingml/2006/main">
+              <a:graphicData uri="http://schemas.openxmlformats.org/drawingml/2006/picture">
+                <pic:pic xmlns:pic="http://schemas.openxmlformats.org/drawingml/2006/picture">
+                  <pic:nvPicPr>
+                    <pic:cNvPr id="0" name="" descr=""/>
+                    <pic:cNvPicPr>
+                      <a:picLocks noChangeAspect="1" noChangeArrowheads="1"/>
+                    </pic:cNvPicPr>
+                  </pic:nvPicPr>
+                  <pic:blipFill>
+                    <a:blip r:embed="rId13" cstate="none"/>
+                    <a:srcRect/>
+                    <a:stretch>
+                      <a:fillRect/>
+                    </a:stretch>
+                  </pic:blipFill>
+                  <pic:spPr bwMode="auto">
+                    <a:xfrm>
+                      <a:off x="0" y="0"/>
+                      <a:ext cx="4572000" cy="2743200"/>
+                    </a:xfrm>
+                    <a:prstGeom prst="rect">
+                      <a:avLst/>
+                    </a:prstGeom>
+                  </pic:spPr>
+                </pic:pic>
+              </a:graphicData>
+            </a:graphic>
+          </wp:inline>
+        </w:drawing>
+      </w:r>
+    </w:p>
+    <w:p>
+      <w:pPr>
+        <w:spacing w:after="200" w:line="240"/>
+        <w:jc w:val="center"/>
+      </w:pPr>
+      <w:r>
+        <w:rPr>
+          <w:rFonts w:ascii="Times New Roman" w:cs="Times New Roman" w:eastAsia="Times New Roman" w:hAnsi="Times New Roman"/>
+          <w:i/>
+          <w:iCs/>
+          <w:color w:val="555555"/>
+          <w:sz w:val="18"/>
+          <w:szCs w:val="18"/>
+        </w:rPr>
+        <w:t xml:space="preserve">Figura 3. Captura real de la terminal ejecutando "PROFILE=smoke k6 run scripts/load_test.js" contra la API en Docker, con el bloque THRESHOLDS cumplido y los checks en verde.</w:t>
       </w:r>
     </w:p>
     <w:p>

</xml_diff>